<commit_message>
Align CA2 presentation and demo plan with User Guide and current dashboard nav.
</commit_message>
<xml_diff>
--- a/deliverables/presentation/GreineQ_CA2_Live_Demo_Plan.docx
+++ b/deliverables/presentation/GreineQ_CA2_Live_Demo_Plan.docx
@@ -12,7 +12,7 @@
     </w:p>
     <w:p>
       <w:r>
-        <w:t>Confirm the permitted slot with the panel. Slides (~5–7 min) plus this demo (~6–8 min) are about 11–15 minutes before Q&amp;A — cut Play if the slot is shorter.</w:t>
+        <w:t>Confirm the permitted slot with the panel. Slides (~5–7 min) plus this demo (~6–8 min) are about 11–15 minutes before Q&amp;A — cut Agent Play if the slot is shorter. Operator detail: deliverables/GreineQ_User_Guide.docx.</w:t>
       </w:r>
     </w:p>
     <w:p>
@@ -68,6 +68,14 @@
         <w:pStyle w:val="ListBullet"/>
       </w:pPr>
       <w:r>
+        <w:t>Top nav: Digital Twin · Price Monitor · Agent Play · Results · Overview</w:t>
+      </w:r>
+    </w:p>
+    <w:p>
+      <w:pPr>
+        <w:pStyle w:val="ListBullet"/>
+      </w:pPr>
+      <w:r>
         <w:t>Day split: Test days (held out).</w:t>
       </w:r>
     </w:p>
@@ -84,7 +92,7 @@
         <w:pStyle w:val="ListBullet"/>
       </w:pPr>
       <w:r>
-        <w:t>Controllers: Greedy (5-action), Current Q, Privileged Q (4h).</w:t>
+        <w:t>Controllers: Greedy (5-action), Current Q, Privileged Q — true 4h signal.</w:t>
       </w:r>
     </w:p>
     <w:p>
@@ -100,7 +108,7 @@
         <w:pStyle w:val="ListBullet"/>
       </w:pPr>
       <w:r>
-        <w:t>Browser: full screen, zoom 100% (test 90–100%); collapse sidebar after Run comparison.</w:t>
+        <w:t>Browser: full screen, zoom 100% (test 90–100%); after Twin loads, collapse sidebar for projection.</w:t>
       </w:r>
     </w:p>
     <w:p>
@@ -140,7 +148,15 @@
         <w:pStyle w:val="ListBullet"/>
       </w:pPr>
       <w:r>
-        <w:t>Have offline screenshots: Twin winner+table, Results cost table, optional short screen recording</w:t>
+        <w:t>Skim User Guide: deliverables/GreineQ_User_Guide.docx</w:t>
+      </w:r>
+    </w:p>
+    <w:p>
+      <w:pPr>
+        <w:pStyle w:val="ListBullet"/>
+      </w:pPr>
+      <w:r>
+        <w:t>Have offline screenshots: Twin winner+table, Results cost chart, optional short screen recording</w:t>
       </w:r>
     </w:p>
     <w:p>
@@ -156,7 +172,7 @@
         <w:pStyle w:val="Heading1"/>
       </w:pPr>
       <w:r>
-        <w:t>Timing (aligned)</w:t>
+        <w:t>Timing (aligned with User Guide demo path)</w:t>
       </w:r>
     </w:p>
     <w:tbl>
@@ -218,7 +234,7 @@
           </w:tcPr>
           <w:p>
             <w:r>
-              <w:t>Landing &amp; hook</w:t>
+              <w:t>Overview &amp; hook</w:t>
             </w:r>
           </w:p>
         </w:tc>
@@ -228,7 +244,7 @@
           </w:tcPr>
           <w:p>
             <w:r>
-              <w:t>Home</w:t>
+              <w:t>Overview</w:t>
             </w:r>
           </w:p>
         </w:tc>
@@ -260,7 +276,7 @@
           </w:tcPr>
           <w:p>
             <w:r>
-              <w:t>Twin</w:t>
+              <w:t>Digital Twin</w:t>
             </w:r>
           </w:p>
         </w:tc>
@@ -314,7 +330,7 @@
           </w:tcPr>
           <w:p>
             <w:r>
-              <w:t>Play vs Agent (oversight) — optional cut</w:t>
+              <w:t>Agent Play (oversight) — optional cut</w:t>
             </w:r>
           </w:p>
         </w:tc>
@@ -324,7 +340,7 @@
           </w:tcPr>
           <w:p>
             <w:r>
-              <w:t>Play</w:t>
+              <w:t>Agent Play</w:t>
             </w:r>
           </w:p>
         </w:tc>
@@ -336,7 +352,39 @@
           </w:tcPr>
           <w:p>
             <w:r>
-              <w:t>8:00–8:30</w:t>
+              <w:t>8:00–8:20</w:t>
+            </w:r>
+          </w:p>
+        </w:tc>
+        <w:tc>
+          <w:tcPr>
+            <w:tcW w:type="dxa" w:w="2880"/>
+          </w:tcPr>
+          <w:p>
+            <w:r>
+              <w:t>Optional: Price Monitor disclosure</w:t>
+            </w:r>
+          </w:p>
+        </w:tc>
+        <w:tc>
+          <w:tcPr>
+            <w:tcW w:type="dxa" w:w="2880"/>
+          </w:tcPr>
+          <w:p>
+            <w:r>
+              <w:t>Price Monitor</w:t>
+            </w:r>
+          </w:p>
+        </w:tc>
+      </w:tr>
+      <w:tr>
+        <w:tc>
+          <w:tcPr>
+            <w:tcW w:type="dxa" w:w="2880"/>
+          </w:tcPr>
+          <w:p>
+            <w:r>
+              <w:t>8:20–8:30</w:t>
             </w:r>
           </w:p>
         </w:tc>
@@ -375,12 +423,12 @@
         <w:pStyle w:val="Heading2"/>
       </w:pPr>
       <w:r>
-        <w:t>Landing (0:00–0:45)</w:t>
+        <w:t>Overview (0:00–0:45)</w:t>
       </w:r>
     </w:p>
     <w:p>
       <w:r>
-        <w:t>Show logo, tagline, CTAs, day-replay animation. Disclose: the landing animation is a heuristic preview, not the trained Q-Learning agent.</w:t>
+        <w:t>Show brand, tagline, CTAs, day-replay animation. Disclose: the landing animation is a heuristic preview, not the trained Q-Learning agent.</w:t>
       </w:r>
     </w:p>
     <w:p>
@@ -393,7 +441,7 @@
     </w:p>
     <w:p>
       <w:r>
-        <w:t>Select day 2012-07-14 if not already selected. Ensure Greedy + Current Q + Privileged Q. Run comparison if needed. Point to winner line, KPIs, table, energy-flow chart. Narrator: same day, same tariff; greedy usually wins; true four-hour direction alone does not close the gap. Collapse sidebar after results load for a cleaner projected view.</w:t>
+        <w:t>Open Digital Twin. Day split = Test; day = 2012-07-14. Ensure Greedy (5-action) + Current Q + Privileged Q — true 4h signal are checked. First open auto-runs once; if settings changed, click Run comparison. Point to winner strip, four KPIs, comparison table, charts, and one step on the timestep inspector. Narrator: same day, same tariff; greedy usually wins; true four-hour direction alone does not close the gap. Do not open Price Monitor on this page — that is a separate view. Collapse sidebar after results load for a cleaner projected view.</w:t>
       </w:r>
     </w:p>
     <w:p>
@@ -406,7 +454,7 @@
     </w:p>
     <w:p>
       <w:r>
-        <w:t>Show curated headline: No-battery reference 160.75 · Perfect-info bound 74.92 · Greedy 90.39 · Current Q ~124 · Privileged true-direction ~140. Say the hypothesis was not supported under this experimental setup.</w:t>
+        <w:t>Show curated headline chart and table: No-battery reference 160.75 · Perfect foresight bound 74.92 · Greedy 90.39 · Current Q ~124 · Privileged true-direction ~140. Say the hypothesis was not supported under this experimental setup. Optional: expand Experiment setup once; do not dwell on per-seed CSV.</w:t>
       </w:r>
     </w:p>
     <w:p>
@@ -414,12 +462,25 @@
         <w:pStyle w:val="Heading2"/>
       </w:pPr>
       <w:r>
-        <w:t>Play vs Agent (6:00–8:00)</w:t>
+        <w:t>Agent Play (6:00–8:00)</w:t>
       </w:r>
     </w:p>
     <w:p>
       <w:r>
-        <w:t>Describe as an interactive oversight demonstration, not a scientifically fair competition: the human sees a realistic 4h forecast while privileged training/eval for headline results used true direction. Show title → description → action buttons. Click one or two actions only. Do not play all 48 steps.</w:t>
+        <w:t>Open Agent Play. Game setup: pick test day, opponent Current Q (prefer for equal-ish story) or Privileged Q, pick frozen seed-42 model, Start game. Describe as an interactive oversight demonstration, not a scientifically fair competition: the human always sees a realistic 4h forecast; Privileged Q may use true direction. Show state cards → action buttons 1–5 → scoreboard. Click one or two actions only. Do not play all 48 steps.</w:t>
+      </w:r>
+    </w:p>
+    <w:p>
+      <w:pPr>
+        <w:pStyle w:val="Heading2"/>
+      </w:pPr>
+      <w:r>
+        <w:t>Price Monitor (optional, ~20s)</w:t>
+      </w:r>
+    </w:p>
+    <w:p>
+      <w:r>
+        <w:t>If time: open Price Monitor. Say clearly — live wholesale from AEMO; PV/load are historical typicals, not a live household meter. This is informational and separate from historical Twin.</w:t>
       </w:r>
     </w:p>
     <w:p>
@@ -451,7 +512,7 @@
         <w:pStyle w:val="ListBullet"/>
       </w:pPr>
       <w:r>
-        <w:t>Twin stuck: Run comparison once; or switch to screenshots</w:t>
+        <w:t>Twin blank / stale: Click Run comparison once; or switch to screenshots</w:t>
       </w:r>
     </w:p>
     <w:p>
@@ -459,7 +520,7 @@
         <w:pStyle w:val="ListBullet"/>
       </w:pPr>
       <w:r>
-        <w:t>Live AEMO down: Expected; disclose fallback to historical replay</w:t>
+        <w:t>Live AEMO down: Expected; disclose fallback to historical Twin — skip Price Monitor</w:t>
       </w:r>
     </w:p>
     <w:p>
@@ -483,7 +544,7 @@
         <w:pStyle w:val="ListNumber"/>
       </w:pPr>
       <w:r>
-        <w:t>Landing → disclose heuristic preview</w:t>
+        <w:t>Overview → disclose heuristic preview</w:t>
       </w:r>
     </w:p>
     <w:p>
@@ -491,7 +552,7 @@
         <w:pStyle w:val="ListNumber"/>
       </w:pPr>
       <w:r>
-        <w:t>Digital Twin day 2012-07-14 · three controllers · results visible</w:t>
+        <w:t>Digital Twin day 2012-07-14 · three controllers · Run comparison · winner strip visible</w:t>
       </w:r>
     </w:p>
     <w:p>
@@ -507,7 +568,15 @@
         <w:pStyle w:val="ListNumber"/>
       </w:pPr>
       <w:r>
-        <w:t>Play (if time) · buttons under description · one action · oversight framing</w:t>
+        <w:t>Agent Play (if time) · setup → Start · one action · oversight framing</w:t>
+      </w:r>
+    </w:p>
+    <w:p>
+      <w:pPr>
+        <w:pStyle w:val="ListNumber"/>
+      </w:pPr>
+      <w:r>
+        <w:t>Optional Price Monitor · live vs typical load disclosure</w:t>
       </w:r>
     </w:p>
     <w:p>

</xml_diff>

<commit_message>
Add Streamlit-parity web Twin and harden dashboard deploy.
Ship FastAPI/web UI with landing hero, Twin experiment settings, Play charts, and Results learnings; fix Streamlit theme/nav and model mismatch guards.
</commit_message>
<xml_diff>
--- a/deliverables/presentation/GreineQ_CA2_Live_Demo_Plan.docx
+++ b/deliverables/presentation/GreineQ_CA2_Live_Demo_Plan.docx
@@ -7,12 +7,17 @@
         <w:pStyle w:val="Title"/>
       </w:pPr>
       <w:r>
-        <w:t>GréineQ CA2 — Live Demo Plan</w:t>
+        <w:t>GréineQ CA2 — 15-minute recorded run</w:t>
       </w:r>
     </w:p>
     <w:p>
       <w:r>
-        <w:t>Confirm the permitted slot with the panel. Slides (~5–7 min) plus this demo (~6–8 min) are about 11–15 minutes before Q&amp;A — cut Agent Play if the slot is shorter. Operator detail: deliverables/GreineQ_User_Guide.docx.</w:t>
+        <w:t>Format: one continuous 15-minute recording. No live panel. No technical Q&amp;A. Operator detail: deliverables/GreineQ_User_Guide.docx.</w:t>
+      </w:r>
+    </w:p>
+    <w:p>
+      <w:r>
+        <w:t>Order: slides 1–8 (~8 min) → dashboard demo (~5–5.5 min) → slide 9 close (~1–1.5 min). Skip slide 10 (sources). Cut Agent Play / Price Monitor first if over time.</w:t>
       </w:r>
     </w:p>
     <w:p>
@@ -28,7 +33,7 @@
         <w:pStyle w:val="ListBullet"/>
       </w:pPr>
       <w:r>
-        <w:t>Driver: Nathan Lucio — clicks only; no improvisation.</w:t>
+        <w:t>Opening &amp; closing (slides 1 and 9): Emmanuel Addoh (10592825) — non-technical; no demo mouse.</w:t>
       </w:r>
     </w:p>
     <w:p>
@@ -36,7 +41,7 @@
         <w:pStyle w:val="ListBullet"/>
       </w:pPr>
       <w:r>
-        <w:t>Narrator: Nadeesha Jayasuriya — speaks over demo; owns clock.</w:t>
+        <w:t>Driver: Nathan Rocha (20082900) — clicks only; no improvisation.</w:t>
       </w:r>
     </w:p>
     <w:p>
@@ -44,7 +49,15 @@
         <w:pStyle w:val="ListBullet"/>
       </w:pPr>
       <w:r>
-        <w:t>Backup operator: swap roles if primary fails; both know the happy path.</w:t>
+        <w:t>Narrator / clock: Nadeesha Jayasuriya (20093736) — speaks over demo.</w:t>
+      </w:r>
+    </w:p>
+    <w:p>
+      <w:pPr>
+        <w:pStyle w:val="ListBullet"/>
+      </w:pPr>
+      <w:r>
+        <w:t>Backup clicks: Bahadir Demir (20098301) — if Nathan needs a hand mid-recording.</w:t>
       </w:r>
     </w:p>
     <w:p>
@@ -60,7 +73,7 @@
         <w:pStyle w:val="ListBullet"/>
       </w:pPr>
       <w:r>
-        <w:t>URL: http://localhost:8501 (local ca2_agent). Do not rely on production.</w:t>
+        <w:t>URL: http://localhost:8501 (local). Do not rely on production for the recording.</w:t>
       </w:r>
     </w:p>
     <w:p>
@@ -100,7 +113,7 @@
         <w:pStyle w:val="ListBullet"/>
       </w:pPr>
       <w:r>
-        <w:t>Exact demo models (forecast_exp, seed 42): Q_q_learning_20260807_180535_forecast_exp_current_seed42.npy · Q_q_learning_20260807_180659_forecast_exp_privileged_seed42.npy (results/models/). Do not retrain mid-demo.</w:t>
+        <w:t>Exact demo models (forecast_exp, seed 42): Q_q_learning_20260807_180535_forecast_exp_current_seed42.npy · Q_q_learning_20260807_180659_forecast_exp_privileged_seed42.npy (results/models/). Do not retrain mid-recording.</w:t>
       </w:r>
     </w:p>
     <w:p>
@@ -108,7 +121,7 @@
         <w:pStyle w:val="ListBullet"/>
       </w:pPr>
       <w:r>
-        <w:t>Browser: full screen, zoom 100% (test 90–100%); after Twin loads, collapse sidebar for projection.</w:t>
+        <w:t>Browser: full screen, zoom 100%; after Twin loads, collapse sidebar for a clean capture.</w:t>
       </w:r>
     </w:p>
     <w:p>
@@ -116,7 +129,7 @@
         <w:pStyle w:val="Heading1"/>
       </w:pPr>
       <w:r>
-        <w:t>Pre-flight (T−15)</w:t>
+        <w:t>Pre-flight (before record)</w:t>
       </w:r>
     </w:p>
     <w:p>
@@ -140,7 +153,7 @@
         <w:pStyle w:val="ListBullet"/>
       </w:pPr>
       <w:r>
-        <w:t>Verify models exist (forecast_exp current + privileged) — if missing, restore verified backups / screenshots; do NOT quick-retrain</w:t>
+        <w:t>Verify forecast_exp current + privileged models — screenshots ready as fallback</w:t>
       </w:r>
     </w:p>
     <w:p>
@@ -148,7 +161,7 @@
         <w:pStyle w:val="ListBullet"/>
       </w:pPr>
       <w:r>
-        <w:t>Skim User Guide: deliverables/GreineQ_User_Guide.docx</w:t>
+        <w:t>Mute notifications; close chat apps; test mic levels for all speakers</w:t>
       </w:r>
     </w:p>
     <w:p>
@@ -156,7 +169,7 @@
         <w:pStyle w:val="ListBullet"/>
       </w:pPr>
       <w:r>
-        <w:t>Have offline screenshots: Twin winner+table, Results cost chart, optional short screen recording</w:t>
+        <w:t>Open PPTX on slides; keep localhost:8501 ready on a second window/desktop</w:t>
       </w:r>
     </w:p>
     <w:p>
@@ -164,7 +177,7 @@
         <w:pStyle w:val="ListBullet"/>
       </w:pPr>
       <w:r>
-        <w:t>Mute notifications; close chat apps</w:t>
+        <w:t>Do a 60-second dry run of Twin Run comparison so the first open is warm</w:t>
       </w:r>
     </w:p>
     <w:p>
@@ -172,7 +185,7 @@
         <w:pStyle w:val="Heading1"/>
       </w:pPr>
       <w:r>
-        <w:t>Timing (aligned with User Guide demo path)</w:t>
+        <w:t>Full 15-minute timing</w:t>
       </w:r>
     </w:p>
     <w:tbl>
@@ -212,7 +225,7 @@
           </w:tcPr>
           <w:p>
             <w:r>
-              <w:t>View</w:t>
+              <w:t>Owner / view</w:t>
             </w:r>
           </w:p>
         </w:tc>
@@ -234,7 +247,7 @@
           </w:tcPr>
           <w:p>
             <w:r>
-              <w:t>Overview &amp; hook</w:t>
+              <w:t>Title &amp; team intro</w:t>
             </w:r>
           </w:p>
         </w:tc>
@@ -244,7 +257,7 @@
           </w:tcPr>
           <w:p>
             <w:r>
-              <w:t>Overview</w:t>
+              <w:t>Emmanuel · Slide 1</w:t>
             </w:r>
           </w:p>
         </w:tc>
@@ -256,7 +269,231 @@
           </w:tcPr>
           <w:p>
             <w:r>
-              <w:t>0:45–4:00</w:t>
+              <w:t>0:45–2:00</w:t>
+            </w:r>
+          </w:p>
+        </w:tc>
+        <w:tc>
+          <w:tcPr>
+            <w:tcW w:type="dxa" w:w="2880"/>
+          </w:tcPr>
+          <w:p>
+            <w:r>
+              <w:t>Problem &amp; CA2 question</w:t>
+            </w:r>
+          </w:p>
+        </w:tc>
+        <w:tc>
+          <w:tcPr>
+            <w:tcW w:type="dxa" w:w="2880"/>
+          </w:tcPr>
+          <w:p>
+            <w:r>
+              <w:t>Nathan · Slide 2</w:t>
+            </w:r>
+          </w:p>
+        </w:tc>
+      </w:tr>
+      <w:tr>
+        <w:tc>
+          <w:tcPr>
+            <w:tcW w:type="dxa" w:w="2880"/>
+          </w:tcPr>
+          <w:p>
+            <w:r>
+              <w:t>2:00–3:15</w:t>
+            </w:r>
+          </w:p>
+        </w:tc>
+        <w:tc>
+          <w:tcPr>
+            <w:tcW w:type="dxa" w:w="2880"/>
+          </w:tcPr>
+          <w:p>
+            <w:r>
+              <w:t>MDP — agent, env, learning</w:t>
+            </w:r>
+          </w:p>
+        </w:tc>
+        <w:tc>
+          <w:tcPr>
+            <w:tcW w:type="dxa" w:w="2880"/>
+          </w:tcPr>
+          <w:p>
+            <w:r>
+              <w:t>Nathan · Slide 3</w:t>
+            </w:r>
+          </w:p>
+        </w:tc>
+      </w:tr>
+      <w:tr>
+        <w:tc>
+          <w:tcPr>
+            <w:tcW w:type="dxa" w:w="2880"/>
+          </w:tcPr>
+          <w:p>
+            <w:r>
+              <w:t>3:15–4:30</w:t>
+            </w:r>
+          </w:p>
+        </w:tc>
+        <w:tc>
+          <w:tcPr>
+            <w:tcW w:type="dxa" w:w="2880"/>
+          </w:tcPr>
+          <w:p>
+            <w:r>
+              <w:t>Experiment design</w:t>
+            </w:r>
+          </w:p>
+        </w:tc>
+        <w:tc>
+          <w:tcPr>
+            <w:tcW w:type="dxa" w:w="2880"/>
+          </w:tcPr>
+          <w:p>
+            <w:r>
+              <w:t>Nadeesha · Slide 4</w:t>
+            </w:r>
+          </w:p>
+        </w:tc>
+      </w:tr>
+      <w:tr>
+        <w:tc>
+          <w:tcPr>
+            <w:tcW w:type="dxa" w:w="2880"/>
+          </w:tcPr>
+          <w:p>
+            <w:r>
+              <w:t>4:30–5:45</w:t>
+            </w:r>
+          </w:p>
+        </w:tc>
+        <w:tc>
+          <w:tcPr>
+            <w:tcW w:type="dxa" w:w="2880"/>
+          </w:tcPr>
+          <w:p>
+            <w:r>
+              <w:t>Aggregate results</w:t>
+            </w:r>
+          </w:p>
+        </w:tc>
+        <w:tc>
+          <w:tcPr>
+            <w:tcW w:type="dxa" w:w="2880"/>
+          </w:tcPr>
+          <w:p>
+            <w:r>
+              <w:t>Nadeesha · Slide 5</w:t>
+            </w:r>
+          </w:p>
+        </w:tc>
+      </w:tr>
+      <w:tr>
+        <w:tc>
+          <w:tcPr>
+            <w:tcW w:type="dxa" w:w="2880"/>
+          </w:tcPr>
+          <w:p>
+            <w:r>
+              <w:t>5:45–6:45</w:t>
+            </w:r>
+          </w:p>
+        </w:tc>
+        <w:tc>
+          <w:tcPr>
+            <w:tcW w:type="dxa" w:w="2880"/>
+          </w:tcPr>
+          <w:p>
+            <w:r>
+              <w:t>Theory vs deployed</w:t>
+            </w:r>
+          </w:p>
+        </w:tc>
+        <w:tc>
+          <w:tcPr>
+            <w:tcW w:type="dxa" w:w="2880"/>
+          </w:tcPr>
+          <w:p>
+            <w:r>
+              <w:t>Nadeesha · Slide 6</w:t>
+            </w:r>
+          </w:p>
+        </w:tc>
+      </w:tr>
+      <w:tr>
+        <w:tc>
+          <w:tcPr>
+            <w:tcW w:type="dxa" w:w="2880"/>
+          </w:tcPr>
+          <w:p>
+            <w:r>
+              <w:t>6:45–7:45</w:t>
+            </w:r>
+          </w:p>
+        </w:tc>
+        <w:tc>
+          <w:tcPr>
+            <w:tcW w:type="dxa" w:w="2880"/>
+          </w:tcPr>
+          <w:p>
+            <w:r>
+              <w:t>Working deployment &amp; ethics</w:t>
+            </w:r>
+          </w:p>
+        </w:tc>
+        <w:tc>
+          <w:tcPr>
+            <w:tcW w:type="dxa" w:w="2880"/>
+          </w:tcPr>
+          <w:p>
+            <w:r>
+              <w:t>Nathan · Slide 7</w:t>
+            </w:r>
+          </w:p>
+        </w:tc>
+      </w:tr>
+      <w:tr>
+        <w:tc>
+          <w:tcPr>
+            <w:tcW w:type="dxa" w:w="2880"/>
+          </w:tcPr>
+          <w:p>
+            <w:r>
+              <w:t>7:45–8:30</w:t>
+            </w:r>
+          </w:p>
+        </w:tc>
+        <w:tc>
+          <w:tcPr>
+            <w:tcW w:type="dxa" w:w="2880"/>
+          </w:tcPr>
+          <w:p>
+            <w:r>
+              <w:t>Limitations &amp; next steps → switch to app</w:t>
+            </w:r>
+          </w:p>
+        </w:tc>
+        <w:tc>
+          <w:tcPr>
+            <w:tcW w:type="dxa" w:w="2880"/>
+          </w:tcPr>
+          <w:p>
+            <w:r>
+              <w:t>Nadeesha · Slide 8</w:t>
+            </w:r>
+          </w:p>
+        </w:tc>
+      </w:tr>
+      <w:tr>
+        <w:tc>
+          <w:tcPr>
+            <w:tcW w:type="dxa" w:w="2880"/>
+          </w:tcPr>
+          <w:p>
+            <w:r>
+              <w:t>8:30–11:30</w:t>
             </w:r>
           </w:p>
         </w:tc>
@@ -276,7 +513,7 @@
           </w:tcPr>
           <w:p>
             <w:r>
-              <w:t>Digital Twin</w:t>
+              <w:t>Nathan / Nadeesha · Twin</w:t>
             </w:r>
           </w:p>
         </w:tc>
@@ -288,7 +525,7 @@
           </w:tcPr>
           <w:p>
             <w:r>
-              <w:t>4:00–6:00</w:t>
+              <w:t>11:30–12:45</w:t>
             </w:r>
           </w:p>
         </w:tc>
@@ -308,7 +545,7 @@
           </w:tcPr>
           <w:p>
             <w:r>
-              <w:t>Results</w:t>
+              <w:t>Nadeesha · Results</w:t>
             </w:r>
           </w:p>
         </w:tc>
@@ -320,7 +557,7 @@
           </w:tcPr>
           <w:p>
             <w:r>
-              <w:t>6:00–8:00</w:t>
+              <w:t>12:45–13:45</w:t>
             </w:r>
           </w:p>
         </w:tc>
@@ -330,7 +567,7 @@
           </w:tcPr>
           <w:p>
             <w:r>
-              <w:t>Agent Play (oversight) — optional cut</w:t>
+              <w:t>Agent Play (1–2 clicks) — cut if late</w:t>
             </w:r>
           </w:p>
         </w:tc>
@@ -340,7 +577,7 @@
           </w:tcPr>
           <w:p>
             <w:r>
-              <w:t>Agent Play</w:t>
+              <w:t>Nathan / Nadeesha · Play</w:t>
             </w:r>
           </w:p>
         </w:tc>
@@ -352,7 +589,7 @@
           </w:tcPr>
           <w:p>
             <w:r>
-              <w:t>8:00–8:20</w:t>
+              <w:t>13:45–15:00</w:t>
             </w:r>
           </w:p>
         </w:tc>
@@ -362,7 +599,7 @@
           </w:tcPr>
           <w:p>
             <w:r>
-              <w:t>Optional: Price Monitor disclosure</w:t>
+              <w:t>Closing takeaways — stop recording</w:t>
             </w:r>
           </w:p>
         </w:tc>
@@ -372,39 +609,7 @@
           </w:tcPr>
           <w:p>
             <w:r>
-              <w:t>Price Monitor</w:t>
-            </w:r>
-          </w:p>
-        </w:tc>
-      </w:tr>
-      <w:tr>
-        <w:tc>
-          <w:tcPr>
-            <w:tcW w:type="dxa" w:w="2880"/>
-          </w:tcPr>
-          <w:p>
-            <w:r>
-              <w:t>8:20–8:30</w:t>
-            </w:r>
-          </w:p>
-        </w:tc>
-        <w:tc>
-          <w:tcPr>
-            <w:tcW w:type="dxa" w:w="2880"/>
-          </w:tcPr>
-          <w:p>
-            <w:r>
-              <w:t>Close + invite Q&amp;A</w:t>
-            </w:r>
-          </w:p>
-        </w:tc>
-        <w:tc>
-          <w:tcPr>
-            <w:tcW w:type="dxa" w:w="2880"/>
-          </w:tcPr>
-          <w:p>
-            <w:r>
-              <w:t>—</w:t>
+              <w:t>Emmanuel · Slide 9</w:t>
             </w:r>
           </w:p>
         </w:tc>
@@ -415,7 +620,7 @@
         <w:pStyle w:val="Heading1"/>
       </w:pPr>
       <w:r>
-        <w:t>Script</w:t>
+        <w:t>Demo script (8:30–13:45)</w:t>
       </w:r>
     </w:p>
     <w:p>
@@ -423,12 +628,12 @@
         <w:pStyle w:val="Heading2"/>
       </w:pPr>
       <w:r>
-        <w:t>Overview (0:00–0:45)</w:t>
+        <w:t>Digital Twin (8:30–11:30)</w:t>
       </w:r>
     </w:p>
     <w:p>
       <w:r>
-        <w:t>Show brand, tagline, CTAs, day-replay animation. Disclose: the landing animation is a heuristic preview, not the trained Q-Learning agent.</w:t>
+        <w:t>Open Digital Twin. Day split = Test; day = 2012-07-14. Ensure Greedy + Current Q + Privileged Q — true 4h signal. Run comparison if needed. Point to winner strip, KPIs, table, one chart, one inspector step. Narrator: same day, same tariff; greedy usually wins; true four-hour direction alone does not close the gap. Skip Price Monitor unless you are ahead of time.</w:t>
       </w:r>
     </w:p>
     <w:p>
@@ -436,12 +641,12 @@
         <w:pStyle w:val="Heading2"/>
       </w:pPr>
       <w:r>
-        <w:t>Digital Twin (0:45–4:00)</w:t>
+        <w:t>Experiment Results (11:30–12:45)</w:t>
       </w:r>
     </w:p>
     <w:p>
       <w:r>
-        <w:t>Open Digital Twin. Day split = Test; day = 2012-07-14. Ensure Greedy (5-action) + Current Q + Privileged Q — true 4h signal are checked. First open auto-runs once; if settings changed, click Run comparison. Point to winner strip, four KPIs, comparison table, charts, and one step on the timestep inspector. Narrator: same day, same tariff; greedy usually wins; true four-hour direction alone does not close the gap. Do not open Price Monitor on this page — that is a separate view. Collapse sidebar after results load for a cleaner projected view.</w:t>
+        <w:t>Headline: No-battery 160.75 · Perfect foresight 74.92 · Greedy 90.39 · Current Q ~124 · Privileged ~140. Say the hypothesis was not supported under this experimental setup.</w:t>
       </w:r>
     </w:p>
     <w:p>
@@ -449,12 +654,12 @@
         <w:pStyle w:val="Heading2"/>
       </w:pPr>
       <w:r>
-        <w:t>Experiment Results (4:00–6:00)</w:t>
+        <w:t>Agent Play (12:45–13:45) — first cut if over time</w:t>
       </w:r>
     </w:p>
     <w:p>
       <w:r>
-        <w:t>Show curated headline chart and table: No-battery reference 160.75 · Perfect foresight bound 74.92 · Greedy 90.39 · Current Q ~124 · Privileged true-direction ~140. Say the hypothesis was not supported under this experimental setup. Optional: expand Experiment setup once; do not dwell on per-seed CSV.</w:t>
+        <w:t>Setup → Current Q opponent → Start. Oversight framing: human sees realistic forecast. One or two actions only. Do not play all 48 steps.</w:t>
       </w:r>
     </w:p>
     <w:p>
@@ -462,25 +667,12 @@
         <w:pStyle w:val="Heading2"/>
       </w:pPr>
       <w:r>
-        <w:t>Agent Play (6:00–8:00)</w:t>
+        <w:t>Closing (13:45–15:00)</w:t>
       </w:r>
     </w:p>
     <w:p>
       <w:r>
-        <w:t>Open Agent Play. Game setup: pick test day, opponent Current Q (prefer for equal-ish story) or Privileged Q, pick frozen seed-42 model, Start game. Describe as an interactive oversight demonstration, not a scientifically fair competition: the human always sees a realistic 4h forecast; Privileged Q may use true direction. Show state cards → action buttons 1–5 → scoreboard. Click one or two actions only. Do not play all 48 steps.</w:t>
-      </w:r>
-    </w:p>
-    <w:p>
-      <w:pPr>
-        <w:pStyle w:val="Heading2"/>
-      </w:pPr>
-      <w:r>
-        <w:t>Price Monitor (optional, ~20s)</w:t>
-      </w:r>
-    </w:p>
-    <w:p>
-      <w:r>
-        <w:t>If time: open Price Monitor. Say clearly — live wholesale from AEMO; PV/load are historical typicals, not a live household meter. This is informational and separate from historical Twin.</w:t>
+        <w:t>Return to slide 9. Emmanuel delivers the one-line takeaway and stops. No Q&amp;A invitation.</w:t>
       </w:r>
     </w:p>
     <w:p>
@@ -488,7 +680,47 @@
         <w:pStyle w:val="Heading1"/>
       </w:pPr>
       <w:r>
-        <w:t>Failure modes</w:t>
+        <w:t>If running long — cut order</w:t>
+      </w:r>
+    </w:p>
+    <w:p>
+      <w:pPr>
+        <w:pStyle w:val="ListNumber"/>
+      </w:pPr>
+      <w:r>
+        <w:t>Drop Price Monitor entirely</w:t>
+      </w:r>
+    </w:p>
+    <w:p>
+      <w:pPr>
+        <w:pStyle w:val="ListNumber"/>
+      </w:pPr>
+      <w:r>
+        <w:t>Drop Agent Play</w:t>
+      </w:r>
+    </w:p>
+    <w:p>
+      <w:pPr>
+        <w:pStyle w:val="ListNumber"/>
+      </w:pPr>
+      <w:r>
+        <w:t>Shorten Twin to winner strip + one table glance only</w:t>
+      </w:r>
+    </w:p>
+    <w:p>
+      <w:pPr>
+        <w:pStyle w:val="ListNumber"/>
+      </w:pPr>
+      <w:r>
+        <w:t>Keep Results numbers + Emmanuel close</w:t>
+      </w:r>
+    </w:p>
+    <w:p>
+      <w:pPr>
+        <w:pStyle w:val="Heading1"/>
+      </w:pPr>
+      <w:r>
+        <w:t>Failure modes (during recording)</w:t>
       </w:r>
     </w:p>
     <w:p>
@@ -496,7 +728,7 @@
         <w:pStyle w:val="ListBullet"/>
       </w:pPr>
       <w:r>
-        <w:t>App crash / duplicate key: Hard refresh; restart streamlit; fall back to screenshots/recording</w:t>
+        <w:t>App crash / duplicate key: Hard refresh or screenshots; keep talking</w:t>
       </w:r>
     </w:p>
     <w:p>
@@ -504,7 +736,7 @@
         <w:pStyle w:val="ListBullet"/>
       </w:pPr>
       <w:r>
-        <w:t>Missing models: Use verified backups + screenshots — never quick-retrain for the live mark</w:t>
+        <w:t>Missing models: Screenshots only — never retrain mid-recording</w:t>
       </w:r>
     </w:p>
     <w:p>
@@ -512,15 +744,7 @@
         <w:pStyle w:val="ListBullet"/>
       </w:pPr>
       <w:r>
-        <w:t>Twin blank / stale: Click Run comparison once; or switch to screenshots</w:t>
-      </w:r>
-    </w:p>
-    <w:p>
-      <w:pPr>
-        <w:pStyle w:val="ListBullet"/>
-      </w:pPr>
-      <w:r>
-        <w:t>Live AEMO down: Expected; disclose fallback to historical Twin — skip Price Monitor</w:t>
+        <w:t>Twin blank / stale: Click Run comparison once; or screenshots</w:t>
       </w:r>
     </w:p>
     <w:p>
@@ -544,7 +768,7 @@
         <w:pStyle w:val="ListNumber"/>
       </w:pPr>
       <w:r>
-        <w:t>Overview → disclose heuristic preview</w:t>
+        <w:t>Slides 1–8 on time (~8:30)</w:t>
       </w:r>
     </w:p>
     <w:p>
@@ -552,7 +776,7 @@
         <w:pStyle w:val="ListNumber"/>
       </w:pPr>
       <w:r>
-        <w:t>Digital Twin day 2012-07-14 · three controllers · Run comparison · winner strip visible</w:t>
+        <w:t>Twin 2012-07-14 · three controllers · winner visible</w:t>
       </w:r>
     </w:p>
     <w:p>
@@ -560,7 +784,7 @@
         <w:pStyle w:val="ListNumber"/>
       </w:pPr>
       <w:r>
-        <w:t>Results page · point at 90.39 vs ~124 vs ~140</w:t>
+        <w:t>Results · 90.39 vs ~124 vs ~140 · hypothesis not supported</w:t>
       </w:r>
     </w:p>
     <w:p>
@@ -568,7 +792,7 @@
         <w:pStyle w:val="ListNumber"/>
       </w:pPr>
       <w:r>
-        <w:t>Agent Play (if time) · setup → Start · one action · oversight framing</w:t>
+        <w:t>Play only if ahead · one action · oversight line</w:t>
       </w:r>
     </w:p>
     <w:p>
@@ -576,15 +800,7 @@
         <w:pStyle w:val="ListNumber"/>
       </w:pPr>
       <w:r>
-        <w:t>Optional Price Monitor · live vs typical load disclosure</w:t>
-      </w:r>
-    </w:p>
-    <w:p>
-      <w:pPr>
-        <w:pStyle w:val="ListNumber"/>
-      </w:pPr>
-      <w:r>
-        <w:t>Close with theory-vs-deployed sentence · stop for Q&amp;A</w:t>
+        <w:t>Slide 9 · Emmanuel close · stop recording at 15:00</w:t>
       </w:r>
     </w:p>
     <w:sectPr>

</xml_diff>